<commit_message>
fix: quittance mail (#79)
Co-authored-by: Christian COLEY <christian.coley@smile.com>
</commit_message>
<xml_diff>
--- a/src/assets/docx/Quittance_de_loyer.docx
+++ b/src/assets/docx/Quittance_de_loyer.docx
@@ -121,6 +121,17 @@
             </w:pPr>
             <w:r>
               <w:rPr/>
+              <w:t>{#represente_par_bodin}</w:t>
+            </w:r>
+          </w:p>
+          <w:p>
+            <w:pPr>
+              <w:pStyle w:val="Normal"/>
+              <w:widowControl w:val="false"/>
+              <w:rPr/>
+            </w:pPr>
+            <w:r>
+              <w:rPr/>
               <w:t>représenté</w:t>
             </w:r>
             <w:r>
@@ -130,6 +141,17 @@
             <w:r>
               <w:rPr/>
               <w:t xml:space="preserve"> par Sylvain BODIN</w:t>
+            </w:r>
+          </w:p>
+          <w:p>
+            <w:pPr>
+              <w:pStyle w:val="Normal"/>
+              <w:widowControl w:val="false"/>
+              <w:rPr/>
+            </w:pPr>
+            <w:r>
+              <w:rPr/>
+              <w:t>{/represente_par_bodin}</w:t>
             </w:r>
           </w:p>
           <w:p>

</xml_diff>